<commit_message>
PD=: pie de página con el nombre del centro y criterios de evaluación con descripción real + %
- Pie de página: el marcador tenía "{{ CENTRO }}" (mayúsculas, no coincidía
  con ninguna clave real) junto a un "IES Andalán" fijo y un comentario
  "RF PONLO BIEN…"; se sustituye por {{ centro }}, y se añade "centro" al
  contexto (faltaba del todo — el diccionario data_pd ya lo traía, pero
  _build_context nunca lo copiaba a context).
- Sección C2: los criterios de evaluación no salían porque el df_ce local
  no trae desc_ce, y el respaldo del catálogo oficial fallaba porque usa
  una numeración distinta a la local (BBDD: "CE1.1", "CE1.2"... / local:
  "CE1.a", "CE1.b"...) — el id normalizado nunca coincide aunque sean los
  mismos criterios. Cuando el recuento de CE coincide entre ambas fuentes,
  se resuelve la descripción por posición dentro del RA. De paso se añade
  el % (peso_ce, ya calculado por la app en Currículo → RA y CE) delante
  de cada criterio.
</commit_message>
<xml_diff>
--- a/backend/templates/modelo_pd_fp=.docx
+++ b/backend/templates/modelo_pd_fp=.docx
@@ -3468,7 +3468,6 @@
               <w:sz w:val="18"/>
               <w:szCs w:val="18"/>
             </w:rPr>
-            <w:t xml:space="preserve"> RF PONLO BIEN… </w:t>
           </w:r>
           <w:proofErr w:type="gramStart"/>
           <w:r>
@@ -3477,7 +3476,7 @@
               <w:szCs w:val="18"/>
               <w:highlight w:val="magenta"/>
             </w:rPr>
-            <w:t>{{ CENTRO</w:t>
+            <w:t>{{ centro }}</w:t>
           </w:r>
           <w:proofErr w:type="gramEnd"/>
           <w:r>
@@ -3486,7 +3485,6 @@
               <w:szCs w:val="18"/>
               <w:highlight w:val="magenta"/>
             </w:rPr>
-            <w:t xml:space="preserve"> }} </w:t>
           </w:r>
           <w:r>
             <w:rPr>
@@ -3494,7 +3492,6 @@
               <w:szCs w:val="18"/>
               <w:highlight w:val="magenta"/>
             </w:rPr>
-            <w:t>IES Andalán</w:t>
           </w:r>
         </w:p>
       </w:tc>

</xml_diff>